<commit_message>
FIn de la journée
</commit_message>
<xml_diff>
--- a/Doc/157443_Voeffray_Lucielle_Rapport_TPI.docx
+++ b/Doc/157443_Voeffray_Lucielle_Rapport_TPI.docx
@@ -2923,8 +2923,8 @@
           <w:lang w:val="fr-CH"/>
         </w:rPr>
       </w:pPr>
-      <w:bookmarkStart w:id="1" w:name="_Toc250790969"/>
-      <w:bookmarkStart w:id="2" w:name="_Toc230014988"/>
+      <w:bookmarkStart w:id="1" w:name="_Toc230014988"/>
+      <w:bookmarkStart w:id="2" w:name="_Toc250790969"/>
       <w:r>
         <w:rPr>
           <w:lang w:val="fr-CH"/>
@@ -2932,7 +2932,7 @@
         <w:lastRenderedPageBreak/>
         <w:t>Résumé du rapport du TPI</w:t>
       </w:r>
-      <w:bookmarkEnd w:id="2"/>
+      <w:bookmarkEnd w:id="1"/>
     </w:p>
     <w:p>
       <w:pPr>
@@ -3110,7 +3110,7 @@
         </w:rPr>
       </w:pPr>
       <w:bookmarkStart w:id="5" w:name="_Toc230014989"/>
-      <w:bookmarkEnd w:id="1"/>
+      <w:bookmarkEnd w:id="2"/>
       <w:r>
         <w:rPr>
           <w:lang w:val="fr-CH"/>
@@ -4470,8 +4470,8 @@
         </w:numPr>
       </w:pPr>
       <w:bookmarkStart w:id="13" w:name="_Toc250790974"/>
-      <w:bookmarkStart w:id="14" w:name="_Toc114965598"/>
-      <w:bookmarkStart w:id="15" w:name="_Toc230014995"/>
+      <w:bookmarkStart w:id="14" w:name="_Toc230014995"/>
+      <w:bookmarkStart w:id="15" w:name="_Toc114965598"/>
       <w:r>
         <w:t xml:space="preserve">Objectifs </w:t>
       </w:r>
@@ -4479,7 +4479,7 @@
       <w:r>
         <w:t>détaillés</w:t>
       </w:r>
-      <w:bookmarkEnd w:id="15"/>
+      <w:bookmarkEnd w:id="14"/>
     </w:p>
     <w:p>
       <w:pPr>
@@ -4767,7 +4767,7 @@
         <w:pStyle w:val="Titre2"/>
       </w:pPr>
       <w:bookmarkStart w:id="16" w:name="_Toc230014996"/>
-      <w:bookmarkEnd w:id="14"/>
+      <w:bookmarkEnd w:id="15"/>
       <w:r>
         <w:t>Analyse par domaines techno</w:t>
       </w:r>
@@ -9293,13 +9293,13 @@
         </w:numPr>
       </w:pPr>
       <w:bookmarkStart w:id="22" w:name="_Toc250790979"/>
-      <w:bookmarkStart w:id="23" w:name="_Toc114965614"/>
-      <w:bookmarkStart w:id="24" w:name="_Toc230015000"/>
+      <w:bookmarkStart w:id="23" w:name="_Toc230015000"/>
+      <w:bookmarkStart w:id="24" w:name="_Toc114965614"/>
       <w:r>
         <w:t>Sécurité de l’information et protection des données</w:t>
       </w:r>
       <w:bookmarkEnd w:id="22"/>
-      <w:bookmarkEnd w:id="24"/>
+      <w:bookmarkEnd w:id="23"/>
     </w:p>
     <w:p>
       <w:pPr>
@@ -10586,12 +10586,12 @@
           <w:numId w:val="16"/>
         </w:numPr>
       </w:pPr>
-      <w:bookmarkStart w:id="34" w:name="_Toc250790985"/>
-      <w:bookmarkStart w:id="35" w:name="_Toc230015005"/>
+      <w:bookmarkStart w:id="34" w:name="_Toc230015005"/>
+      <w:bookmarkStart w:id="35" w:name="_Toc250790985"/>
       <w:r>
         <w:t>Rôles et droits</w:t>
       </w:r>
-      <w:bookmarkEnd w:id="35"/>
+      <w:bookmarkEnd w:id="34"/>
     </w:p>
     <w:p>
       <w:pPr>
@@ -10624,7 +10624,7 @@
       <w:r>
         <w:t>Concept de formation</w:t>
       </w:r>
-      <w:bookmarkEnd w:id="34"/>
+      <w:bookmarkEnd w:id="35"/>
       <w:bookmarkEnd w:id="36"/>
     </w:p>
     <w:p>
@@ -10794,12 +10794,12 @@
           <w:numId w:val="16"/>
         </w:numPr>
       </w:pPr>
-      <w:bookmarkStart w:id="39" w:name="_Toc250790987"/>
-      <w:bookmarkStart w:id="40" w:name="_Toc230015008"/>
+      <w:bookmarkStart w:id="39" w:name="_Toc230015008"/>
+      <w:bookmarkStart w:id="40" w:name="_Toc250790987"/>
       <w:r>
         <w:t>Conception de Ansible</w:t>
       </w:r>
-      <w:bookmarkEnd w:id="40"/>
+      <w:bookmarkEnd w:id="39"/>
     </w:p>
     <w:p>
       <w:pPr>
@@ -11805,7 +11805,7 @@
       <w:r>
         <w:t>Moyens nécessaires</w:t>
       </w:r>
-      <w:bookmarkEnd w:id="39"/>
+      <w:bookmarkEnd w:id="40"/>
       <w:bookmarkEnd w:id="41"/>
     </w:p>
     <w:p>
@@ -15449,7 +15449,6 @@
           <w:color w:val="545454"/>
           <w:sz w:val="18"/>
           <w:szCs w:val="18"/>
-          <w:lang w:val="en-GB"/>
         </w:rPr>
       </w:pPr>
       <w:r>
@@ -15458,7 +15457,6 @@
           <w:color w:val="545454"/>
           <w:sz w:val="18"/>
           <w:szCs w:val="18"/>
-          <w:lang w:val="en-GB"/>
         </w:rPr>
         <w:t xml:space="preserve">pveceph pool create vm_storage --size </w:t>
       </w:r>
@@ -15468,7 +15466,6 @@
           <w:color w:val="008000"/>
           <w:sz w:val="18"/>
           <w:szCs w:val="18"/>
-          <w:lang w:val="en-GB"/>
         </w:rPr>
         <w:t>3</w:t>
       </w:r>
@@ -15478,7 +15475,6 @@
           <w:color w:val="545454"/>
           <w:sz w:val="18"/>
           <w:szCs w:val="18"/>
-          <w:lang w:val="en-GB"/>
         </w:rPr>
         <w:t xml:space="preserve"> --min_size </w:t>
       </w:r>
@@ -15488,7 +15484,6 @@
           <w:color w:val="008000"/>
           <w:sz w:val="18"/>
           <w:szCs w:val="18"/>
-          <w:lang w:val="en-GB"/>
         </w:rPr>
         <w:t>2</w:t>
       </w:r>
@@ -15498,7 +15493,6 @@
           <w:color w:val="545454"/>
           <w:sz w:val="18"/>
           <w:szCs w:val="18"/>
-          <w:lang w:val="en-GB"/>
         </w:rPr>
         <w:t xml:space="preserve"> --pg_autoscale_mode on --application rbd</w:t>
       </w:r>
@@ -15538,7 +15532,6 @@
           <w:color w:val="545454"/>
           <w:sz w:val="18"/>
           <w:szCs w:val="18"/>
-          <w:lang w:val="en-GB"/>
         </w:rPr>
       </w:pPr>
       <w:r>
@@ -15547,7 +15540,6 @@
           <w:color w:val="545454"/>
           <w:sz w:val="18"/>
           <w:szCs w:val="18"/>
-          <w:lang w:val="en-GB"/>
         </w:rPr>
         <w:t xml:space="preserve">pvesm </w:t>
       </w:r>
@@ -15559,7 +15551,6 @@
           <w:color w:val="7928A1"/>
           <w:sz w:val="18"/>
           <w:szCs w:val="18"/>
-          <w:lang w:val="en-GB"/>
         </w:rPr>
         <w:t>add</w:t>
       </w:r>
@@ -15569,7 +15560,6 @@
           <w:color w:val="545454"/>
           <w:sz w:val="18"/>
           <w:szCs w:val="18"/>
-          <w:lang w:val="en-GB"/>
         </w:rPr>
         <w:t xml:space="preserve"> rbd vm_storage --pool vm_storage --content images</w:t>
       </w:r>
@@ -16014,7 +16004,22 @@
         <w:divId w:val="1822503158"/>
       </w:pPr>
       <w:r>
-        <w:t>Créer une ACL qui permet l’accès à /pool/ansible-vms au group et au rôle précédemment créé :</w:t>
+        <w:t>Créer une ACL qui permet l’accès à /pool/ansible-vms au group</w:t>
+      </w:r>
+      <w:r>
+        <w:t>e</w:t>
+      </w:r>
+      <w:r>
+        <w:t xml:space="preserve"> </w:t>
+      </w:r>
+      <w:r>
+        <w:t>précédemment créé</w:t>
+      </w:r>
+      <w:r>
+        <w:t xml:space="preserve"> avec les rôles nécessaires</w:t>
+      </w:r>
+      <w:r>
+        <w:t> :</w:t>
       </w:r>
     </w:p>
     <w:p>
@@ -16196,7 +16201,17 @@
           <w:szCs w:val="18"/>
           <w:lang w:val="en-GB"/>
         </w:rPr>
-        <w:t>PVEDatastoreUser</w:t>
+        <w:t>PVEDatastore</w:t>
+      </w:r>
+      <w:r>
+        <w:rPr>
+          <w:rFonts w:ascii="Consolas" w:hAnsi="Consolas" w:cs="Courier New"/>
+          <w:color w:val="007FAA"/>
+          <w:sz w:val="18"/>
+          <w:szCs w:val="18"/>
+          <w:lang w:val="en-GB"/>
+        </w:rPr>
+        <w:t>Admin</w:t>
       </w:r>
     </w:p>
     <w:p>
@@ -16277,7 +16292,17 @@
           <w:szCs w:val="18"/>
           <w:lang w:val="en-GB"/>
         </w:rPr>
-        <w:t>PVEDatastoreUser</w:t>
+        <w:t>PVEDatastore</w:t>
+      </w:r>
+      <w:r>
+        <w:rPr>
+          <w:rFonts w:ascii="Consolas" w:hAnsi="Consolas" w:cs="Courier New"/>
+          <w:color w:val="007FAA"/>
+          <w:sz w:val="18"/>
+          <w:szCs w:val="18"/>
+          <w:lang w:val="en-GB"/>
+        </w:rPr>
+        <w:t>Admin</w:t>
       </w:r>
     </w:p>
     <w:p>
@@ -16625,7 +16650,6 @@
           <w:color w:val="545454"/>
           <w:sz w:val="18"/>
           <w:szCs w:val="18"/>
-          <w:lang w:val="en-GB"/>
         </w:rPr>
       </w:pPr>
       <w:r>
@@ -16634,7 +16658,6 @@
           <w:color w:val="545454"/>
           <w:sz w:val="18"/>
           <w:szCs w:val="18"/>
-          <w:lang w:val="en-GB"/>
         </w:rPr>
         <w:t xml:space="preserve">  git \</w:t>
       </w:r>
@@ -16674,7 +16697,6 @@
           <w:color w:val="545454"/>
           <w:sz w:val="18"/>
           <w:szCs w:val="18"/>
-          <w:lang w:val="en-GB"/>
         </w:rPr>
       </w:pPr>
       <w:r>
@@ -16683,7 +16705,6 @@
           <w:color w:val="545454"/>
           <w:sz w:val="18"/>
           <w:szCs w:val="18"/>
-          <w:lang w:val="en-GB"/>
         </w:rPr>
         <w:t xml:space="preserve">  openssh-server \</w:t>
       </w:r>
@@ -16723,7 +16744,6 @@
           <w:color w:val="545454"/>
           <w:sz w:val="18"/>
           <w:szCs w:val="18"/>
-          <w:lang w:val="en-GB"/>
         </w:rPr>
       </w:pPr>
       <w:r>
@@ -16732,7 +16752,6 @@
           <w:color w:val="545454"/>
           <w:sz w:val="18"/>
           <w:szCs w:val="18"/>
-          <w:lang w:val="en-GB"/>
         </w:rPr>
         <w:t xml:space="preserve">  sshpass \</w:t>
       </w:r>
@@ -16781,9 +16800,18 @@
           <w:color w:val="545454"/>
           <w:sz w:val="18"/>
           <w:szCs w:val="18"/>
+        </w:rPr>
+        <w:t xml:space="preserve">  </w:t>
+      </w:r>
+      <w:r>
+        <w:rPr>
+          <w:rFonts w:ascii="Consolas" w:hAnsi="Consolas" w:cs="Courier New"/>
+          <w:color w:val="545454"/>
+          <w:sz w:val="18"/>
+          <w:szCs w:val="18"/>
           <w:lang w:val="en-GB"/>
         </w:rPr>
-        <w:t xml:space="preserve">  curl \</w:t>
+        <w:t>curl \</w:t>
       </w:r>
     </w:p>
     <w:p>
@@ -20332,7 +20360,6 @@
           <w:color w:val="545454"/>
           <w:sz w:val="18"/>
           <w:szCs w:val="18"/>
-          <w:lang w:val="en-GB"/>
         </w:rPr>
       </w:pPr>
       <w:r>
@@ -20341,7 +20368,6 @@
           <w:color w:val="545454"/>
           <w:sz w:val="18"/>
           <w:szCs w:val="18"/>
-          <w:lang w:val="en-GB"/>
         </w:rPr>
         <w:t>--citype configdrive2</w:t>
       </w:r>
@@ -21134,8 +21160,14 @@
       <w:pPr>
         <w:pStyle w:val="BITTextkrper"/>
         <w:divId w:val="1257444993"/>
-      </w:pPr>
-      <w:r>
+        <w:rPr>
+          <w:lang w:val="en-GB"/>
+        </w:rPr>
+      </w:pPr>
+      <w:r>
+        <w:rPr>
+          <w:lang w:val="en-GB"/>
+        </w:rPr>
         <w:t>Finalement, lancer sysprep :</w:t>
       </w:r>
     </w:p>
@@ -21194,8 +21226,14 @@
         <w:divId w:val="625965064"/>
       </w:pPr>
       <w:r>
+        <w:rPr>
+          <w:lang w:val="en-GB"/>
+        </w:rPr>
         <w:lastRenderedPageBreak/>
-        <w:t> Une fois ceci fait, l</w:t>
+        <w:t> </w:t>
+      </w:r>
+      <w:r>
+        <w:t>Une fois ceci fait, l</w:t>
       </w:r>
       <w:r>
         <w:t>a VM va s’éteindre et on peut passer à la préparation des templates</w:t>
@@ -22096,8 +22134,8 @@
           <w:lang w:val="fr-CH"/>
         </w:rPr>
       </w:pPr>
-      <w:bookmarkStart w:id="58" w:name="_Toc250790996"/>
-      <w:bookmarkStart w:id="59" w:name="_Toc230015017"/>
+      <w:bookmarkStart w:id="58" w:name="_Toc230015017"/>
+      <w:bookmarkStart w:id="59" w:name="_Toc250790996"/>
       <w:r>
         <w:rPr>
           <w:lang w:val="fr-CH"/>
@@ -22105,7 +22143,7 @@
         <w:lastRenderedPageBreak/>
         <w:t>Problèmes rencontrés</w:t>
       </w:r>
-      <w:bookmarkEnd w:id="59"/>
+      <w:bookmarkEnd w:id="58"/>
     </w:p>
     <w:p>
       <w:pPr>
@@ -22347,12 +22385,157 @@
     </w:p>
     <w:p>
       <w:pPr>
+        <w:pStyle w:val="Titre3"/>
+        <w:divId w:val="1386298709"/>
+      </w:pPr>
+      <w:r>
+        <w:t>Clone du template</w:t>
+      </w:r>
+    </w:p>
+    <w:p>
+      <w:pPr>
+        <w:pStyle w:val="BITTextkrper"/>
+        <w:divId w:val="1386298709"/>
+      </w:pPr>
+      <w:r>
+        <w:t>Ansible ne détectait pas le template du server. Le problème venait que, lors de la création de la VM, je ne l’avais pas placé dans la ressource pool de Ansible.</w:t>
+      </w:r>
+    </w:p>
+    <w:p>
+      <w:pPr>
+        <w:pStyle w:val="BITTextkrper"/>
+        <w:divId w:val="1386298709"/>
+      </w:pPr>
+      <w:r>
+        <w:lastRenderedPageBreak/>
+        <w:t>Pour corriger ça :</w:t>
+      </w:r>
+    </w:p>
+    <w:p>
+      <w:pPr>
+        <w:pStyle w:val="NormalWeb"/>
+        <w:pBdr>
+          <w:top w:val="single" w:sz="6" w:space="2" w:color="888888"/>
+          <w:left w:val="single" w:sz="6" w:space="2" w:color="888888"/>
+          <w:bottom w:val="single" w:sz="6" w:space="2" w:color="888888"/>
+          <w:right w:val="single" w:sz="6" w:space="2" w:color="888888"/>
+        </w:pBdr>
+        <w:shd w:val="clear" w:color="auto" w:fill="FEFEFE"/>
+        <w:tabs>
+          <w:tab w:val="left" w:pos="916"/>
+          <w:tab w:val="left" w:pos="1832"/>
+          <w:tab w:val="left" w:pos="2748"/>
+          <w:tab w:val="left" w:pos="3664"/>
+          <w:tab w:val="left" w:pos="4580"/>
+          <w:tab w:val="left" w:pos="5496"/>
+          <w:tab w:val="left" w:pos="6412"/>
+          <w:tab w:val="left" w:pos="7328"/>
+          <w:tab w:val="left" w:pos="8244"/>
+          <w:tab w:val="left" w:pos="9160"/>
+          <w:tab w:val="left" w:pos="10076"/>
+          <w:tab w:val="left" w:pos="10992"/>
+          <w:tab w:val="left" w:pos="11908"/>
+          <w:tab w:val="left" w:pos="12824"/>
+          <w:tab w:val="left" w:pos="13740"/>
+          <w:tab w:val="left" w:pos="14656"/>
+        </w:tabs>
+        <w:spacing w:before="0" w:beforeAutospacing="0" w:after="0" w:afterAutospacing="0"/>
+        <w:divId w:val="1592004525"/>
+        <w:rPr>
+          <w:rFonts w:ascii="Consolas" w:hAnsi="Consolas" w:cs="Courier New"/>
+          <w:color w:val="545454"/>
+          <w:sz w:val="18"/>
+          <w:szCs w:val="18"/>
+          <w:lang w:val="en-GB"/>
+        </w:rPr>
+      </w:pPr>
+      <w:bookmarkStart w:id="62" w:name="_Toc230015020"/>
+      <w:r>
+        <w:rPr>
+          <w:rFonts w:ascii="Consolas" w:hAnsi="Consolas" w:cs="Courier New"/>
+          <w:color w:val="545454"/>
+          <w:sz w:val="18"/>
+          <w:szCs w:val="18"/>
+          <w:lang w:val="en-GB"/>
+        </w:rPr>
+        <w:t xml:space="preserve">pvesh </w:t>
+      </w:r>
+      <w:r>
+        <w:rPr>
+          <w:rFonts w:ascii="Consolas" w:hAnsi="Consolas" w:cs="Courier New"/>
+          <w:b/>
+          <w:bCs/>
+          <w:color w:val="7928A1"/>
+          <w:sz w:val="18"/>
+          <w:szCs w:val="18"/>
+          <w:lang w:val="en-GB"/>
+        </w:rPr>
+        <w:t>set</w:t>
+      </w:r>
+      <w:r>
+        <w:rPr>
+          <w:rFonts w:ascii="Consolas" w:hAnsi="Consolas" w:cs="Courier New"/>
+          <w:color w:val="545454"/>
+          <w:sz w:val="18"/>
+          <w:szCs w:val="18"/>
+          <w:lang w:val="en-GB"/>
+        </w:rPr>
+        <w:t xml:space="preserve"> /pools/ansible-vms –vms </w:t>
+      </w:r>
+      <w:r>
+        <w:rPr>
+          <w:rFonts w:ascii="Consolas" w:hAnsi="Consolas" w:cs="Courier New"/>
+          <w:color w:val="008000"/>
+          <w:sz w:val="18"/>
+          <w:szCs w:val="18"/>
+          <w:lang w:val="en-GB"/>
+        </w:rPr>
+        <w:t>101</w:t>
+      </w:r>
+    </w:p>
+    <w:p>
+      <w:pPr>
+        <w:pStyle w:val="Titre3"/>
+        <w:divId w:val="1592004525"/>
+        <w:rPr>
+          <w:lang w:val="en-GB"/>
+        </w:rPr>
+      </w:pPr>
+      <w:r>
+        <w:rPr>
+          <w:lang w:val="en-GB"/>
+        </w:rPr>
+        <w:t>Playbook reçoit un 403</w:t>
+      </w:r>
+    </w:p>
+    <w:p>
+      <w:pPr>
+        <w:pStyle w:val="BITTextkrper"/>
+        <w:divId w:val="1592004525"/>
+      </w:pPr>
+      <w:r>
+        <w:t>Lors du lancement du p</w:t>
+      </w:r>
+      <w:r>
+        <w:t>laybook, Proxmox répond un 403 sur le template à cloner, alors qu’avec CURL ça fonctionne.</w:t>
+      </w:r>
+    </w:p>
+    <w:p>
+      <w:pPr>
+        <w:pStyle w:val="BITTextkrper"/>
+        <w:divId w:val="1592004525"/>
+      </w:pPr>
+      <w:r>
+        <w:t>Solution : Contrôler son orthographe dans le fichier all.yml</w:t>
+      </w:r>
+    </w:p>
+    <w:p>
+      <w:pPr>
         <w:pStyle w:val="Titre1"/>
         <w:rPr>
           <w:lang w:val="fr-CH"/>
         </w:rPr>
       </w:pPr>
-      <w:bookmarkStart w:id="62" w:name="_Toc230015020"/>
       <w:r>
         <w:rPr>
           <w:lang w:val="fr-CH"/>
@@ -22852,7 +23035,7 @@
         </w:rPr>
         <w:t>iste des sources et références</w:t>
       </w:r>
-      <w:bookmarkEnd w:id="58"/>
+      <w:bookmarkEnd w:id="59"/>
       <w:bookmarkEnd w:id="66"/>
     </w:p>
     <w:sdt>
@@ -24255,7 +24438,7 @@
         <w:pStyle w:val="BITTextkrper"/>
       </w:pPr>
     </w:p>
-    <w:bookmarkEnd w:id="23"/>
+    <w:bookmarkEnd w:id="24"/>
     <w:p>
       <w:pPr>
         <w:pStyle w:val="BITTextkrper"/>
@@ -24595,7 +24778,7 @@
                   <w:fldChar w:fldCharType="separate"/>
                 </w:r>
                 <w:r>
-                  <w:t>18.05.2026 15:26</w:t>
+                  <w:t>19.05.2026 11:51</w:t>
                 </w:r>
                 <w:r>
                   <w:rPr>
@@ -24976,7 +25159,7 @@
                   <w:fldChar w:fldCharType="separate"/>
                 </w:r>
                 <w:r>
-                  <w:t>18.05.2026 15:26</w:t>
+                  <w:t>19.05.2026 11:51</w:t>
                 </w:r>
                 <w:r>
                   <w:rPr>
@@ -25227,7 +25410,7 @@
                   <w:fldChar w:fldCharType="separate"/>
                 </w:r>
                 <w:r>
-                  <w:t>18.05.2026 15:26</w:t>
+                  <w:t>19.05.2026 11:51</w:t>
                 </w:r>
                 <w:r>
                   <w:rPr>
@@ -28786,6 +28969,7 @@
   <w:style w:type="character" w:default="1" w:styleId="Policepardfaut">
     <w:name w:val="Default Paragraph Font"/>
     <w:uiPriority w:val="1"/>
+    <w:semiHidden/>
     <w:unhideWhenUsed/>
   </w:style>
   <w:style w:type="table" w:default="1" w:styleId="TableauNormal">
@@ -30650,12 +30834,14 @@
     <w:rsid w:val="000B6621"/>
     <w:rsid w:val="00130A2E"/>
     <w:rsid w:val="00186045"/>
+    <w:rsid w:val="00247F9B"/>
     <w:rsid w:val="00253E52"/>
     <w:rsid w:val="002E02A8"/>
     <w:rsid w:val="002F486A"/>
     <w:rsid w:val="00307334"/>
     <w:rsid w:val="003E682A"/>
     <w:rsid w:val="00540217"/>
+    <w:rsid w:val="005A67CE"/>
     <w:rsid w:val="00631607"/>
     <w:rsid w:val="00683E05"/>
     <w:rsid w:val="006B0397"/>
@@ -30683,6 +30869,7 @@
     <w:rsid w:val="00D47A21"/>
     <w:rsid w:val="00D76462"/>
     <w:rsid w:val="00DD7C7C"/>
+    <w:rsid w:val="00E6069F"/>
     <w:rsid w:val="00E834E4"/>
     <w:rsid w:val="00F1051B"/>
     <w:rsid w:val="00F13D1D"/>
@@ -31236,20 +31423,6 @@
       <w14:ligatures w14:val="standardContextual"/>
     </w:rPr>
   </w:style>
-  <w:style w:type="paragraph" w:customStyle="1" w:styleId="32439FBD99EF4E88A82638D0862AFF53">
-    <w:name w:val="32439FBD99EF4E88A82638D0862AFF53"/>
-    <w:rsid w:val="00130A2E"/>
-    <w:pPr>
-      <w:spacing w:line="278" w:lineRule="auto"/>
-    </w:pPr>
-    <w:rPr>
-      <w:kern w:val="2"/>
-      <w:sz w:val="24"/>
-      <w:szCs w:val="24"/>
-      <w:lang w:eastAsia="ja-JP"/>
-      <w14:ligatures w14:val="standardContextual"/>
-    </w:rPr>
-  </w:style>
   <w:style w:type="paragraph" w:customStyle="1" w:styleId="3AE21CAD6F544795B8100D2E4DCBA92B">
     <w:name w:val="3AE21CAD6F544795B8100D2E4DCBA92B"/>
     <w:rsid w:val="00130A2E"/>

</xml_diff>